<commit_message>
fix: render selected estate plan provisions
</commit_message>
<xml_diff>
--- a/tools/aubreylaw-docgeneration/templates/durable-power-of-attorney.docx
+++ b/tools/aubreylaw-docgeneration/templates/durable-power-of-attorney.docx
@@ -106,6 +106,76 @@
       <w:r/>
     </w:p>
     <w:p>
+      <w:r>
+        <w:t>{% if fiduciaries.agent.co_primary.full_name %}</w:t>
+      </w:r>
+    </w:p>
+    <w:p>
+      <w:pPr>
+        <w:pStyle w:val="TextHeading2"/>
+      </w:pPr>
+      <w:r>
+        <w:t>I also appoint {{ fiduciaries.agent.co_primary.full_name | name }} to serve with {{ fiduciaries.agent.primary.full_name | name }} as my co-Attorney in Fact.</w:t>
+      </w:r>
+    </w:p>
+    <w:p>
+      <w:pPr>
+        <w:pStyle w:val="Heading2"/>
+      </w:pPr>
+      <w:r>
+        <w:t>Co-Agent Authority</w:t>
+      </w:r>
+    </w:p>
+    <w:p>
+      <w:r>
+        <w:t>{% if fiduciaries.agent.co_agents_action == 'joint' %}</w:t>
+      </w:r>
+    </w:p>
+    <w:p>
+      <w:pPr>
+        <w:pStyle w:val="TextHeading2"/>
+      </w:pPr>
+      <w:r>
+        <w:t>If more than one Attorney-in-Fact is serving at any time, the Attorneys-in-Fact shall act jointly with respect to all matters within the scope of this Power of Attorney. No Attorney-in-Fact shall have authority to act alone except as the other Attorneys-in-Fact may delegate in writing.</w:t>
+      </w:r>
+    </w:p>
+    <w:p>
+      <w:r>
+        <w:t>{% elif fiduciaries.agent.co_agents_action == 'majority' %}</w:t>
+      </w:r>
+    </w:p>
+    <w:p>
+      <w:pPr>
+        <w:pStyle w:val="TextHeading2"/>
+      </w:pPr>
+      <w:r>
+        <w:t>If more than one Attorney-in-Fact is serving at any time, the Attorneys-in-Fact shall act by majority decision with respect to all matters within the scope of this Power of Attorney. If two Attorneys-in-Fact are serving, they shall act unanimously.</w:t>
+      </w:r>
+    </w:p>
+    <w:p>
+      <w:r>
+        <w:t>{% else %}</w:t>
+      </w:r>
+    </w:p>
+    <w:p>
+      <w:pPr>
+        <w:pStyle w:val="TextHeading2"/>
+      </w:pPr>
+      <w:r>
+        <w:t>If more than one Attorney-in-Fact is serving at any time, each Attorney-in-Fact may act separately and independently, and any third party may rely upon the signature or written consent of either Attorney-in-Fact acting alone.</w:t>
+      </w:r>
+    </w:p>
+    <w:p>
+      <w:r>
+        <w:t>{% endif %}</w:t>
+      </w:r>
+    </w:p>
+    <w:p>
+      <w:r>
+        <w:t>{% endif %}</w:t>
+      </w:r>
+    </w:p>
+    <w:p>
       <w:pPr>
         <w:pStyle w:val="Heading2"/>
       </w:pPr>
@@ -2830,6 +2900,32 @@
       </w:r>
     </w:p>
     <w:p>
+      <w:r>
+        <w:t>{% if dpoa.include_section_l %}</w:t>
+      </w:r>
+    </w:p>
+    <w:p>
+      <w:pPr>
+        <w:pStyle w:val="Heading2"/>
+      </w:pPr>
+      <w:r>
+        <w:t>CARE IN PROXIMITY OF SPOUSE AND FOR BENEFIT OF SPOUSE</w:t>
+      </w:r>
+    </w:p>
+    <w:p>
+      <w:pPr>
+        <w:pStyle w:val="TextHeading2"/>
+      </w:pPr>
+      <w:r>
+        <w:t>The authority of my Attorney in Fact under this document expressly includes, without implying any limitation in other respects, authority to expend my resources to make it possible for me to reside, or be cared for, in as close proximity as possible to my spouse, {{ spouse.full_name | name }}, to support and maintain the household I share or shared with {{ spouse.pronoun_object }}, and to provide for {{ spouse.pronoun_possessive }} support, maintenance, and health needs.</w:t>
+      </w:r>
+    </w:p>
+    <w:p>
+      <w:r>
+        <w:t>{% endif %}</w:t>
+      </w:r>
+    </w:p>
+    <w:p>
       <w:pPr>
         <w:pStyle w:val="Heading1"/>
       </w:pPr>
@@ -3446,6 +3542,50 @@
       </w:r>
       <w:r>
         <w:t xml:space="preserve"> may exercise the power or discretion. </w:t>
+      </w:r>
+    </w:p>
+    <w:p>
+      <w:r>
+        <w:t>{% if dpoa.self_dealing_reviewer.full_name %}</w:t>
+      </w:r>
+    </w:p>
+    <w:p>
+      <w:pPr>
+        <w:pStyle w:val="Heading2"/>
+      </w:pPr>
+      <w:r>
+        <w:t>Self-Dealing Reviewer</w:t>
+      </w:r>
+    </w:p>
+    <w:p>
+      <w:pPr>
+        <w:pStyle w:val="TextHeading2"/>
+      </w:pPr>
+      <w:r>
+        <w:t>I designate {{ dpoa.self_dealing_reviewer.full_name | name }} to review and assent in writing to any action by my Attorney in Fact that primarily benefits my Attorney in Fact and requires the assent of a party with a substantial adverse interest.</w:t>
+      </w:r>
+    </w:p>
+    <w:p>
+      <w:r>
+        <w:t>{% if dpoa.self_dealing_reviewer_alt.full_name %}</w:t>
+      </w:r>
+    </w:p>
+    <w:p>
+      <w:pPr>
+        <w:pStyle w:val="TextHeading2"/>
+      </w:pPr>
+      <w:r>
+        <w:t>If {{ dpoa.self_dealing_reviewer.full_name | name }} is unwilling or unable to serve, I designate {{ dpoa.self_dealing_reviewer_alt.full_name | name }} as alternate reviewer.</w:t>
+      </w:r>
+    </w:p>
+    <w:p>
+      <w:r>
+        <w:t>{% endif %}</w:t>
+      </w:r>
+    </w:p>
+    <w:p>
+      <w:r>
+        <w:t>{% endif %}</w:t>
       </w:r>
     </w:p>
     <w:p>

</xml_diff>